<commit_message>
Completar nombre del docente en la portada del informe
Co-Authored-By: Claude Opus 5 <noreply@anthropic.com>
Claude-Session: https://claude.ai/code/session_01AEW3dVwLj4PR156dCYeSPu
</commit_message>
<xml_diff>
--- a/Informe_Marca_Personal_Semana4_Nicolas_Pedreros.docx
+++ b/Informe_Marca_Personal_Semana4_Nicolas_Pedreros.docx
@@ -289,7 +289,7 @@
                                 <w:rStyle w:val="Estilo2"/>
                                 <w:color w:val="002345"/>
                               </w:rPr>
-                              <w:t xml:space="preserve">Docente: </w:t>
+                              <w:t xml:space="preserve">Docente: Gonzalo Riquelme Isla</w:t>
                             </w:r>
                           </w:p>
                           <w:p>
@@ -375,7 +375,7 @@
                           <w:rStyle w:val="Estilo2"/>
                           <w:color w:val="002345"/>
                         </w:rPr>
-                        <w:t xml:space="preserve">Docente: </w:t>
+                        <w:t xml:space="preserve">Docente: Gonzalo Riquelme Isla</w:t>
                       </w:r>
                     </w:p>
                     <w:p>

</xml_diff>

<commit_message>
Dejar el índice como texto fijo y adjuntar versión PDF
El índice ya no es un campo de Word: los títulos y los números de página
quedan escritos de forma permanente, por lo que no requiere actualizarse
al abrir el documento. Se agrega además una copia en PDF para revisión.

Co-Authored-By: Claude Opus 5 <noreply@anthropic.com>
Claude-Session: https://claude.ai/code/session_01AEW3dVwLj4PR156dCYeSPu
</commit_message>
<xml_diff>
--- a/Informe_Marca_Personal_Semana4_Nicolas_Pedreros.docx
+++ b/Informe_Marca_Personal_Semana4_Nicolas_Pedreros.docx
@@ -402,235 +402,145 @@
         </mc:AlternateContent>
       </w:r>
     </w:p>
-    <w:sdt>
-      <w:sdtPr>
-        <w:rPr>
-          <w:rFonts w:asciiTheme="minorHAnsi" w:eastAsiaTheme="minorHAnsi" w:hAnsiTheme="minorHAnsi" w:cstheme="minorBidi"/>
-          <w:b w:val="0"/>
-          <w:bCs w:val="0"/>
-          <w:color w:val="auto"/>
-          <w:sz w:val="22"/>
-          <w:szCs w:val="22"/>
-          <w:lang w:val="es-ES" w:eastAsia="en-US"/>
-        </w:rPr>
-        <w:id w:val="997852750"/>
-        <w:docPartObj>
-          <w:docPartGallery w:val="Table of Contents"/>
-          <w:docPartUnique/>
-        </w:docPartObj>
-      </w:sdtPr>
-      <w:sdtEndPr>
+    <w:p>
+      <w:pPr>
+        <w:pStyle w:val="TtuloTDC"/>
+        <w:rPr>
+          <w:rFonts w:ascii="Arial" w:hAnsi="Arial" w:cs="Arial"/>
+          <w:color w:val="404040" w:themeColor="text1" w:themeTint="BF"/>
+          <w:lang w:val="es-ES"/>
+        </w:rPr>
+      </w:pPr>
+      <w:r>
+        <w:rPr>
+          <w:rFonts w:ascii="Arial" w:hAnsi="Arial" w:cs="Arial"/>
+          <w:color w:val="404040" w:themeColor="text1" w:themeTint="BF"/>
+          <w:lang w:val="es-ES"/>
+        </w:rPr>
+        <w:t>Índice</w:t>
+      </w:r>
+    </w:p>
+    <w:p>
+      <w:pPr>
+        <w:rPr>
+          <w:color w:val="404040" w:themeColor="text1" w:themeTint="BF"/>
+          <w:lang w:val="es-ES" w:eastAsia="es-ES_tradnl"/>
+        </w:rPr>
+      </w:pPr>
+    </w:p>
+    <w:p>
+      <w:pPr>
+        <w:pStyle w:val="TDC1"/>
+        <w:tabs>
+          <w:tab w:val="right" w:leader="dot" w:pos="9345"/>
+        </w:tabs>
         <w:rPr>
           <w:noProof/>
-          <w:lang w:val="es-CL"/>
-        </w:rPr>
-      </w:sdtEndPr>
-      <w:sdtContent>
-        <w:p>
-          <w:pPr>
-            <w:pStyle w:val="TtuloTDC"/>
-            <w:rPr>
-              <w:rFonts w:ascii="Arial" w:hAnsi="Arial" w:cs="Arial"/>
-              <w:color w:val="404040" w:themeColor="text1" w:themeTint="BF"/>
-              <w:lang w:val="es-ES"/>
-            </w:rPr>
-          </w:pPr>
-          <w:r>
-            <w:rPr>
-              <w:rFonts w:ascii="Arial" w:hAnsi="Arial" w:cs="Arial"/>
-              <w:color w:val="404040" w:themeColor="text1" w:themeTint="BF"/>
-              <w:lang w:val="es-ES"/>
-            </w:rPr>
-            <w:t>Índice</w:t>
-          </w:r>
-        </w:p>
-        <w:p>
-          <w:pPr>
-            <w:rPr>
-              <w:color w:val="404040" w:themeColor="text1" w:themeTint="BF"/>
-              <w:lang w:val="es-ES" w:eastAsia="es-ES_tradnl"/>
-            </w:rPr>
-          </w:pPr>
-        </w:p>
-        <w:p>
-          <w:pPr>
-            <w:pStyle w:val="TDC1"/>
-            <w:tabs>
-              <w:tab w:val="right" w:leader="dot" w:pos="9345"/>
-            </w:tabs>
-            <w:rPr>
-              <w:noProof/>
-              <w:color w:val="404040" w:themeColor="text1" w:themeTint="BF"/>
-            </w:rPr>
-          </w:pPr>
-          <w:r>
-            <w:rPr>
-              <w:b w:val="0"/>
-              <w:bCs w:val="0"/>
-              <w:color w:val="404040" w:themeColor="text1" w:themeTint="BF"/>
-            </w:rPr>
-            <w:fldChar w:fldCharType="begin"/>
-          </w:r>
-          <w:r>
-            <w:rPr>
-              <w:color w:val="404040" w:themeColor="text1" w:themeTint="BF"/>
-            </w:rPr>
-            <w:instrText>TOC \o "1-3" \h \z \u</w:instrText>
-          </w:r>
-          <w:r>
-            <w:rPr>
-              <w:b w:val="0"/>
-              <w:bCs w:val="0"/>
-              <w:color w:val="404040" w:themeColor="text1" w:themeTint="BF"/>
-            </w:rPr>
-            <w:fldChar w:fldCharType="separate"/>
-          </w:r>
-          <w:hyperlink w:anchor="_Toc46485953" w:history="1">
-            <w:r>
-              <w:rPr>
-                <w:rStyle w:val="Hipervnculo"/>
-                <w:rFonts w:ascii="Arial" w:hAnsi="Arial" w:cs="Arial"/>
-                <w:noProof/>
-                <w:color w:val="404040" w:themeColor="text1" w:themeTint="BF"/>
-              </w:rPr>
-              <w:t>Introducción</w:t>
-            </w:r>
-            <w:r>
-              <w:rPr>
-                <w:noProof/>
-                <w:webHidden/>
-                <w:color w:val="404040" w:themeColor="text1" w:themeTint="BF"/>
-              </w:rPr>
-              <w:tab/>
-              <w:fldChar w:fldCharType="begin"/>
-              <w:instrText xml:space="preserve"> PAGEREF _Toc46485953 \h </w:instrText>
-              <w:fldChar w:fldCharType="separate"/>
-              <w:t>3</w:t>
-              <w:fldChar w:fldCharType="end"/>
-            </w:r>
-          </w:hyperlink>
-        </w:p>
-        <w:p>
-          <w:pPr>
-            <w:pStyle w:val="TDC1"/>
-            <w:tabs>
-              <w:tab w:val="right" w:leader="dot" w:pos="9345"/>
-            </w:tabs>
-            <w:rPr>
-              <w:noProof/>
-              <w:color w:val="404040" w:themeColor="text1" w:themeTint="BF"/>
-            </w:rPr>
-          </w:pPr>
-          <w:hyperlink w:anchor="_Toc46485954" w:history="1">
-            <w:r>
-              <w:rPr>
-                <w:rStyle w:val="Hipervnculo"/>
-                <w:rFonts w:ascii="Arial" w:hAnsi="Arial" w:cs="Arial"/>
-                <w:noProof/>
-                <w:color w:val="404040" w:themeColor="text1" w:themeTint="BF"/>
-              </w:rPr>
-              <w:t>Desarrollo</w:t>
-            </w:r>
-            <w:r>
-              <w:rPr>
-                <w:noProof/>
-                <w:webHidden/>
-                <w:color w:val="404040" w:themeColor="text1" w:themeTint="BF"/>
-              </w:rPr>
-              <w:tab/>
-              <w:fldChar w:fldCharType="begin"/>
-              <w:instrText xml:space="preserve"> PAGEREF _Toc46485954 \h </w:instrText>
-              <w:fldChar w:fldCharType="separate"/>
-              <w:t>4</w:t>
-              <w:fldChar w:fldCharType="end"/>
-            </w:r>
-          </w:hyperlink>
-        </w:p>
-        <w:p>
-          <w:pPr>
-            <w:pStyle w:val="TDC1"/>
-            <w:tabs>
-              <w:tab w:val="right" w:leader="dot" w:pos="9345"/>
-            </w:tabs>
-            <w:rPr>
-              <w:noProof/>
-              <w:color w:val="404040" w:themeColor="text1" w:themeTint="BF"/>
-            </w:rPr>
-          </w:pPr>
-          <w:hyperlink w:anchor="_Toc46485955" w:history="1">
-            <w:r>
-              <w:rPr>
-                <w:rStyle w:val="Hipervnculo"/>
-                <w:rFonts w:ascii="Arial" w:hAnsi="Arial" w:cs="Arial"/>
-                <w:noProof/>
-                <w:color w:val="404040" w:themeColor="text1" w:themeTint="BF"/>
-              </w:rPr>
-              <w:t>Conclusión</w:t>
-            </w:r>
-            <w:r>
-              <w:rPr>
-                <w:noProof/>
-                <w:webHidden/>
-                <w:color w:val="404040" w:themeColor="text1" w:themeTint="BF"/>
-              </w:rPr>
-              <w:tab/>
-              <w:fldChar w:fldCharType="begin"/>
-              <w:instrText xml:space="preserve"> PAGEREF _Toc46485955 \h </w:instrText>
-              <w:fldChar w:fldCharType="separate"/>
-              <w:t>8</w:t>
-              <w:fldChar w:fldCharType="end"/>
-            </w:r>
-          </w:hyperlink>
-        </w:p>
-        <w:p>
-          <w:pPr>
-            <w:pStyle w:val="TDC1"/>
-            <w:tabs>
-              <w:tab w:val="right" w:leader="dot" w:pos="9345"/>
-            </w:tabs>
-            <w:rPr>
-              <w:noProof/>
-              <w:color w:val="404040" w:themeColor="text1" w:themeTint="BF"/>
-            </w:rPr>
-          </w:pPr>
-          <w:hyperlink w:anchor="_Toc46485956" w:history="1">
-            <w:r>
-              <w:rPr>
-                <w:rStyle w:val="Hipervnculo"/>
-                <w:rFonts w:ascii="Arial" w:hAnsi="Arial" w:cs="Arial"/>
-                <w:noProof/>
-                <w:color w:val="404040" w:themeColor="text1" w:themeTint="BF"/>
-              </w:rPr>
-              <w:t>Referencias bibliográficas</w:t>
-            </w:r>
-            <w:r>
-              <w:rPr>
-                <w:noProof/>
-                <w:webHidden/>
-                <w:color w:val="404040" w:themeColor="text1" w:themeTint="BF"/>
-              </w:rPr>
-              <w:tab/>
-              <w:fldChar w:fldCharType="begin"/>
-              <w:instrText xml:space="preserve"> PAGEREF _Toc46485956 \h </w:instrText>
-              <w:fldChar w:fldCharType="separate"/>
-              <w:t>9</w:t>
-              <w:fldChar w:fldCharType="end"/>
-            </w:r>
-          </w:hyperlink>
-        </w:p>
-        <w:p>
-          <w:r>
-            <w:rPr>
-              <w:b/>
-              <w:bCs/>
-              <w:noProof/>
-              <w:color w:val="404040" w:themeColor="text1" w:themeTint="BF"/>
-            </w:rPr>
-            <w:fldChar w:fldCharType="end"/>
-          </w:r>
-        </w:p>
-      </w:sdtContent>
-    </w:sdt>
+          <w:color w:val="404040" w:themeColor="text1" w:themeTint="BF"/>
+        </w:rPr>
+      </w:pPr>
+      <w:r>
+        <w:rPr>
+          <w:rFonts w:ascii="Arial" w:hAnsi="Arial" w:cs="Arial"/>
+          <w:noProof/>
+          <w:color w:val="404040" w:themeColor="text1" w:themeTint="BF"/>
+        </w:rPr>
+        <w:t>Introducción</w:t>
+      </w:r>
+      <w:r>
+        <w:rPr>
+          <w:noProof/>
+          <w:color w:val="404040" w:themeColor="text1" w:themeTint="BF"/>
+        </w:rPr>
+        <w:tab/>
+        <w:t>3</w:t>
+      </w:r>
+    </w:p>
+    <w:p>
+      <w:pPr>
+        <w:pStyle w:val="TDC1"/>
+        <w:tabs>
+          <w:tab w:val="right" w:leader="dot" w:pos="9345"/>
+        </w:tabs>
+        <w:rPr>
+          <w:noProof/>
+          <w:color w:val="404040" w:themeColor="text1" w:themeTint="BF"/>
+        </w:rPr>
+      </w:pPr>
+      <w:r>
+        <w:rPr>
+          <w:rFonts w:ascii="Arial" w:hAnsi="Arial" w:cs="Arial"/>
+          <w:noProof/>
+          <w:color w:val="404040" w:themeColor="text1" w:themeTint="BF"/>
+        </w:rPr>
+        <w:t>Desarrollo</w:t>
+      </w:r>
+      <w:r>
+        <w:rPr>
+          <w:noProof/>
+          <w:color w:val="404040" w:themeColor="text1" w:themeTint="BF"/>
+        </w:rPr>
+        <w:tab/>
+        <w:t>4</w:t>
+      </w:r>
+    </w:p>
+    <w:p>
+      <w:pPr>
+        <w:pStyle w:val="TDC1"/>
+        <w:tabs>
+          <w:tab w:val="right" w:leader="dot" w:pos="9345"/>
+        </w:tabs>
+        <w:rPr>
+          <w:noProof/>
+          <w:color w:val="404040" w:themeColor="text1" w:themeTint="BF"/>
+        </w:rPr>
+      </w:pPr>
+      <w:r>
+        <w:rPr>
+          <w:rFonts w:ascii="Arial" w:hAnsi="Arial" w:cs="Arial"/>
+          <w:noProof/>
+          <w:color w:val="404040" w:themeColor="text1" w:themeTint="BF"/>
+        </w:rPr>
+        <w:t>Conclusión</w:t>
+      </w:r>
+      <w:r>
+        <w:rPr>
+          <w:noProof/>
+          <w:color w:val="404040" w:themeColor="text1" w:themeTint="BF"/>
+        </w:rPr>
+        <w:tab/>
+        <w:t>8</w:t>
+      </w:r>
+    </w:p>
+    <w:p>
+      <w:pPr>
+        <w:pStyle w:val="TDC1"/>
+        <w:tabs>
+          <w:tab w:val="right" w:leader="dot" w:pos="9345"/>
+        </w:tabs>
+        <w:rPr>
+          <w:noProof/>
+          <w:color w:val="404040" w:themeColor="text1" w:themeTint="BF"/>
+        </w:rPr>
+      </w:pPr>
+      <w:r>
+        <w:rPr>
+          <w:rFonts w:ascii="Arial" w:hAnsi="Arial" w:cs="Arial"/>
+          <w:noProof/>
+          <w:color w:val="404040" w:themeColor="text1" w:themeTint="BF"/>
+        </w:rPr>
+        <w:t>Referencias bibliográficas</w:t>
+      </w:r>
+      <w:r>
+        <w:rPr>
+          <w:noProof/>
+          <w:color w:val="404040" w:themeColor="text1" w:themeTint="BF"/>
+        </w:rPr>
+        <w:tab/>
+        <w:t>9</w:t>
+      </w:r>
+    </w:p>
+    <w:p/>
     <w:p>
       <w:pPr>
         <w:spacing w:line="360" w:lineRule="auto"/>

</xml_diff>